<commit_message>
recorte da v0.225, artefatos regerados
</commit_message>
<xml_diff>
--- a/manual/Fundamento-MANUAL-v7.docx
+++ b/manual/Fundamento-MANUAL-v7.docx
@@ -40023,7 +40023,37 @@
         <w:t xml:space="preserve">Personagem de jogador testa a cada dano que toma, sem limite. Inimigo testa no máximo uma vez por jogador que acertou ele na rodada</w:t>
       </w:r>
       <w:r>
-        <w:t xml:space="preserve">, por mais golpes que esse jogador dê.</w:t>
+        <w:t xml:space="preserve">, por mais golpes que esse jogador dê. </w:t>
+      </w:r>
+      <w:r>
+        <w:rPr>
+          <w:b/>
+          <w:bCs/>
+        </w:rPr>
+        <w:t xml:space="preserve">Golpe de invocação não conta:</w:t>
+      </w:r>
+      <w:r>
+        <w:t xml:space="preserve"> ele tira vida do inimigo, e não faz o inimigo testar.</w:t>
+      </w:r>
+    </w:p>
+    <w:p>
+      <w:pPr>
+        <w:pStyle w:val="ListParagraph"/>
+        <w:numPr>
+          <w:ilvl w:val="0"/>
+          <w:numId w:val="2"/>
+        </w:numPr>
+        <w:spacing w:after="90" w:line="268"/>
+      </w:pPr>
+      <w:r>
+        <w:rPr>
+          <w:b/>
+          <w:bCs/>
+        </w:rPr>
+        <w:t xml:space="preserve">Este teste não ocupa a sua Concentração, e a Mão Firme não protege dele.</w:t>
+      </w:r>
+      <w:r>
+        <w:t xml:space="preserve"> Você pode segurar o domínio na corrida e seguir concentrando num efeito, e as duas rolagens são separadas.</w:t>
       </w:r>
     </w:p>
     <w:p>

</xml_diff>